<commit_message>
commit week 2 / 4
</commit_message>
<xml_diff>
--- a/Tasks/6.3D/documents/task_log.docx
+++ b/Tasks/6.3D/documents/task_log.docx
@@ -3,24 +3,142 @@
 <w:document xmlns:wpc="http://schemas.microsoft.com/office/word/2010/wordprocessingCanvas" xmlns:cx="http://schemas.microsoft.com/office/drawing/2014/chartex" xmlns:cx1="http://schemas.microsoft.com/office/drawing/2015/9/8/chartex" xmlns:cx2="http://schemas.microsoft.com/office/drawing/2015/10/21/chartex" xmlns:cx3="http://schemas.microsoft.com/office/drawing/2016/5/9/chartex" xmlns:cx4="http://schemas.microsoft.com/office/drawing/2016/5/10/chartex" xmlns:cx5="http://schemas.microsoft.com/office/drawing/2016/5/11/chartex" xmlns:cx6="http://schemas.microsoft.com/office/drawing/2016/5/12/chartex" xmlns:cx7="http://schemas.microsoft.com/office/drawing/2016/5/13/chartex" xmlns:cx8="http://schemas.microsoft.com/office/drawing/2016/5/14/chartex" xmlns:mc="http://schemas.openxmlformats.org/markup-compatibility/2006" xmlns:aink="http://schemas.microsoft.com/office/drawing/2016/ink" xmlns:am3d="http://schemas.microsoft.com/office/drawing/2017/model3d" xmlns:o="urn:schemas-microsoft-com:office:office" xmlns:oel="http://schemas.microsoft.com/office/2019/extlst" xmlns:r="http://schemas.openxmlformats.org/officeDocument/2006/relationships" xmlns:m="http://schemas.openxmlformats.org/officeDocument/2006/math" xmlns:v="urn:schemas-microsoft-com:vml" xmlns:wp14="http://schemas.microsoft.com/office/word/2010/wordprocessingDrawing" xmlns:wp="http://schemas.openxmlformats.org/drawingml/2006/wordprocessingDrawing" xmlns:w10="urn:schemas-microsoft-com:office:word" xmlns:w="http://schemas.openxmlformats.org/wordprocessingml/2006/main" xmlns:w14="http://schemas.microsoft.com/office/word/2010/wordml" xmlns:w15="http://schemas.microsoft.com/office/word/2012/wordml" xmlns:w16cex="http://schemas.microsoft.com/office/word/2018/wordml/cex" xmlns:w16cid="http://schemas.microsoft.com/office/word/2016/wordml/cid" xmlns:w16="http://schemas.microsoft.com/office/word/2018/wordml" xmlns:w16du="http://schemas.microsoft.com/office/word/2023/wordml/word16du" xmlns:w16sdtdh="http://schemas.microsoft.com/office/word/2020/wordml/sdtdatahash" xmlns:w16sdtfl="http://schemas.microsoft.com/office/word/2024/wordml/sdtformatlock" xmlns:w16se="http://schemas.microsoft.com/office/word/2015/wordml/symex" xmlns:wpg="http://schemas.microsoft.com/office/word/2010/wordprocessingGroup" xmlns:wpi="http://schemas.microsoft.com/office/word/2010/wordprocessingInk" xmlns:wne="http://schemas.microsoft.com/office/word/2006/wordml" xmlns:wps="http://schemas.microsoft.com/office/word/2010/wordprocessingShape" mc:Ignorable="w14 w15 w16se w16cid w16 w16cex w16sdtdh w16sdtfl w16du wp14">
   <w:body>
     <w:p>
+      <w:r>
+        <w:t>Week 1 Progress Report: Foundation, Architecture, and Basic Data Flow</w:t>
+      </w:r>
+    </w:p>
+    <w:p>
+      <w:r>
+        <w:t>1. AWS Infrastructure and Security Setup</w:t>
+      </w:r>
+    </w:p>
+    <w:p>
+      <w:r>
+        <w:t>The initial phase of the project focused on establishing a secure and scalable cloud environment on AWS, a core requirement of the plan. A dedicated IAM (Identity and Access Management) user was created, following security best practices to avoid using the root account. This user was granted specific, limited permissions for the services required by the project, including AWS IoT Core, Lambda, DynamoDB, API Gateway, and CloudWatch. The AWS Command Line Interface (CLI) was then configured on the local machine using the IAM user's credentials, which was verified to only have the permissions granted. This setup ensures a secure foundation for managing the entire system through programmatic access.</w:t>
+      </w:r>
+    </w:p>
+    <w:p>
+      <w:r>
+        <w:pict w14:anchorId="025B4776">
+          <v:rect id="_x0000_i1025" style="width:0;height:1.5pt" o:hralign="center" o:hrstd="t" o:hr="t" fillcolor="#a0a0a0" stroked="f"/>
+        </w:pict>
+      </w:r>
+    </w:p>
+    <w:p>
+      <w:r>
+        <w:t>2. System Architecture and Data Design</w:t>
+      </w:r>
+    </w:p>
+    <w:p>
+      <w:r>
+        <w:t xml:space="preserve">Before any development, the system's architecture and data flow were refined. A detailed block diagram was created to illustrate how all components, from simulated sensors to the cloud platform, would interconnect. This modular design supports the project's objective of achieving a demonstrable, scalable solution by allowing for the independent scaling of each component. The data </w:t>
+      </w:r>
+      <w:proofErr w:type="gramStart"/>
+      <w:r>
+        <w:t>schema</w:t>
+      </w:r>
+      <w:proofErr w:type="gramEnd"/>
+      <w:r>
+        <w:t xml:space="preserve"> for the </w:t>
+      </w:r>
+      <w:proofErr w:type="spellStart"/>
+      <w:r>
+        <w:t>SensorData</w:t>
+      </w:r>
+      <w:proofErr w:type="spellEnd"/>
+      <w:r>
+        <w:t xml:space="preserve"> table in DynamoDB was finalized with </w:t>
+      </w:r>
+      <w:proofErr w:type="spellStart"/>
+      <w:r>
+        <w:t>deviceId</w:t>
+      </w:r>
+      <w:proofErr w:type="spellEnd"/>
+      <w:r>
+        <w:t xml:space="preserve"> as the partition key and timestamp as the </w:t>
+      </w:r>
+      <w:proofErr w:type="gramStart"/>
+      <w:r>
+        <w:t>sort</w:t>
+      </w:r>
+      <w:proofErr w:type="gramEnd"/>
+      <w:r>
+        <w:t xml:space="preserve"> key, enabling efficient data retrieval. This structure provides a standardized, scalable method for data organization. A hierarchical MQTT topic structure was also defined to ensure efficient message routing and organization for future device scaling.</w:t>
+      </w:r>
+    </w:p>
+    <w:p>
+      <w:r>
+        <w:pict w14:anchorId="02D13D62">
+          <v:rect id="_x0000_i1026" style="width:0;height:1.5pt" o:hralign="center" o:hrstd="t" o:hr="t" fillcolor="#a0a0a0" stroked="f"/>
+        </w:pict>
+      </w:r>
+    </w:p>
+    <w:p>
+      <w:r>
+        <w:t>3. Simulated Sensor and Data Ingestion</w:t>
+      </w:r>
+    </w:p>
+    <w:p>
+      <w:r>
+        <w:t>A Node.js script was developed to act as a simulated ambient light sensor, a crucial step for setting up the data collection process without physical hardware. This simulator generates realistic data, including time-of-day cycles and random noise, to accurately represent real-world conditions. A key part of this step was creating an IoT "Thing" in AWS IoT Core and using its generated certificates to establish a secure MQTT connection. The successful connection was verified by pinging the AWS IoT Core endpoint and observing the published payload in the AWS IoT test client. This confirms that secure, authenticated communication is operational.</w:t>
+      </w:r>
+    </w:p>
+    <w:p>
+      <w:r>
+        <w:pict w14:anchorId="302C95F7">
+          <v:rect id="_x0000_i1027" style="width:0;height:1.5pt" o:hralign="center" o:hrstd="t" o:hr="t" fillcolor="#a0a0a0" stroked="f"/>
+        </w:pict>
+      </w:r>
+    </w:p>
+    <w:p>
+      <w:r>
+        <w:lastRenderedPageBreak/>
+        <w:t>4. Data Storage and Basic Processing</w:t>
+      </w:r>
+    </w:p>
+    <w:p>
+      <w:r>
+        <w:t xml:space="preserve">The week concluded by establishing the first end-to-end data flow pipeline. A DynamoDB table named </w:t>
+      </w:r>
+      <w:proofErr w:type="spellStart"/>
+      <w:r>
+        <w:t>SensorData</w:t>
+      </w:r>
+      <w:proofErr w:type="spellEnd"/>
+      <w:r>
+        <w:t xml:space="preserve"> was created, with </w:t>
+      </w:r>
+      <w:proofErr w:type="spellStart"/>
+      <w:r>
+        <w:t>deviceId</w:t>
+      </w:r>
+      <w:proofErr w:type="spellEnd"/>
+      <w:r>
+        <w:t xml:space="preserve"> and timestamp as the primary key and sort key respectively. An AWS IoT Rule was then implemented to automatically route incoming sensor data to a CloudWatch Log Group, providing real-time visibility and a means for rapid troubleshooting. This data flow was successfully tested and the messages sent by the simulated sensor were displayed in the CloudWatch Logs, confirming that the entire pipeline from the device to the cloud logging service is operational.</w:t>
+      </w:r>
+    </w:p>
+    <w:p>
+      <w:r>
+        <w:t>Current Data Flow Pipeline</w:t>
+      </w:r>
+    </w:p>
+    <w:p>
+      <w:r>
+        <w:t>Sensor Simulator → MQTT → AWS IoT Core → IoT Rule → CloudWatch Logs &amp; DynamoDB (Ready)</w:t>
+      </w:r>
+    </w:p>
+    <w:p>
       <w:pPr>
         <w:rPr>
           <w:b/>
           <w:bCs/>
         </w:rPr>
       </w:pPr>
-      <w:r>
-        <w:rPr>
-          <w:b/>
-          <w:bCs/>
-        </w:rPr>
-        <w:t>Week 1 Progress Report: Scalable Smart Home Lighting System</w:t>
-      </w:r>
     </w:p>
     <w:p>
       <w:r>
         <w:pict w14:anchorId="208F3C24">
-          <v:rect id="_x0000_i1100" style="width:0;height:.75pt" o:hralign="center" o:hrstd="t" o:hr="t" fillcolor="#a0a0a0" stroked="f"/>
+          <v:rect id="_x0000_i1028" style="width:0;height:.75pt" o:hralign="center" o:hrstd="t" o:hr="t" fillcolor="#a0a0a0" stroked="f"/>
         </w:pict>
       </w:r>
     </w:p>
@@ -138,7 +256,7 @@
     <w:p>
       <w:r>
         <w:pict w14:anchorId="3202F111">
-          <v:rect id="_x0000_i1101" style="width:0;height:.75pt" o:hralign="center" o:hrstd="t" o:hr="t" fillcolor="#a0a0a0" stroked="f"/>
+          <v:rect id="_x0000_i1029" style="width:0;height:.75pt" o:hralign="center" o:hrstd="t" o:hr="t" fillcolor="#a0a0a0" stroked="f"/>
         </w:pict>
       </w:r>
     </w:p>
@@ -174,6 +292,7 @@
         </w:numPr>
       </w:pPr>
       <w:r>
+        <w:lastRenderedPageBreak/>
         <w:t>Created detailed block diagram showing all system components</w:t>
       </w:r>
     </w:p>
@@ -185,7 +304,39 @@
         </w:numPr>
       </w:pPr>
       <w:r>
-        <w:t>Designed MQTT topic structure (iot/sensors/{location}/{deviceType}/{deviceId}/data)</w:t>
+        <w:t>Designed MQTT topic structure (</w:t>
+      </w:r>
+      <w:proofErr w:type="spellStart"/>
+      <w:r>
+        <w:t>iot</w:t>
+      </w:r>
+      <w:proofErr w:type="spellEnd"/>
+      <w:r>
+        <w:t>/</w:t>
+      </w:r>
+      <w:proofErr w:type="gramStart"/>
+      <w:r>
+        <w:t>sensors/{location}/{</w:t>
+      </w:r>
+      <w:proofErr w:type="spellStart"/>
+      <w:r>
+        <w:t>deviceType</w:t>
+      </w:r>
+      <w:proofErr w:type="spellEnd"/>
+      <w:r>
+        <w:t>}/{</w:t>
+      </w:r>
+      <w:proofErr w:type="spellStart"/>
+      <w:r>
+        <w:t>deviceId</w:t>
+      </w:r>
+      <w:proofErr w:type="spellEnd"/>
+      <w:r>
+        <w:t>}/</w:t>
+      </w:r>
+      <w:proofErr w:type="gramEnd"/>
+      <w:r>
+        <w:t>data)</w:t>
       </w:r>
     </w:p>
     <w:p>
@@ -211,7 +362,39 @@
           <w:b/>
           <w:bCs/>
         </w:rPr>
-        <w:t>Why this design works:</w:t>
+        <w:t xml:space="preserve">Why </w:t>
+      </w:r>
+      <w:proofErr w:type="gramStart"/>
+      <w:r>
+        <w:rPr>
+          <w:b/>
+          <w:bCs/>
+        </w:rPr>
+        <w:t>this</w:t>
+      </w:r>
+      <w:proofErr w:type="gramEnd"/>
+      <w:r>
+        <w:rPr>
+          <w:b/>
+          <w:bCs/>
+        </w:rPr>
+        <w:t xml:space="preserve"> design </w:t>
+      </w:r>
+      <w:proofErr w:type="gramStart"/>
+      <w:r>
+        <w:rPr>
+          <w:b/>
+          <w:bCs/>
+        </w:rPr>
+        <w:t>works</w:t>
+      </w:r>
+      <w:proofErr w:type="gramEnd"/>
+      <w:r>
+        <w:rPr>
+          <w:b/>
+          <w:bCs/>
+        </w:rPr>
+        <w:t>:</w:t>
       </w:r>
     </w:p>
     <w:p>
@@ -247,7 +430,6 @@
         </w:numPr>
       </w:pPr>
       <w:r>
-        <w:lastRenderedPageBreak/>
         <w:t>Standardized communication supports thousands of devices</w:t>
       </w:r>
     </w:p>
@@ -265,7 +447,7 @@
     <w:p>
       <w:r>
         <w:pict w14:anchorId="35E6F7A9">
-          <v:rect id="_x0000_i1102" style="width:0;height:.75pt" o:hralign="center" o:hrstd="t" o:hr="t" fillcolor="#a0a0a0" stroked="f"/>
+          <v:rect id="_x0000_i1030" style="width:0;height:.75pt" o:hralign="center" o:hrstd="t" o:hr="t" fillcolor="#a0a0a0" stroked="f"/>
         </w:pict>
       </w:r>
     </w:p>
@@ -349,7 +531,15 @@
     </w:p>
     <w:p>
       <w:r>
-        <w:t>Physical sensors are expensive and unreliable for testing. Our simulator generates realistic data including time-of-day cycles, weather effects, and battery simulation. This allows us to test with hundreds of devices without hardware costs or setup complexity.</w:t>
+        <w:t xml:space="preserve">Physical sensors are expensive and unreliable for testing. Our simulator generates realistic data including time-of-day cycles, weather effects, and battery simulation. This allows us to </w:t>
+      </w:r>
+      <w:proofErr w:type="gramStart"/>
+      <w:r>
+        <w:t>test with</w:t>
+      </w:r>
+      <w:proofErr w:type="gramEnd"/>
+      <w:r>
+        <w:t xml:space="preserve"> hundreds of devices without hardware costs or setup complexity.</w:t>
       </w:r>
     </w:p>
     <w:p>
@@ -407,8 +597,9 @@
     </w:p>
     <w:p>
       <w:r>
+        <w:lastRenderedPageBreak/>
         <w:pict w14:anchorId="78B7EA1B">
-          <v:rect id="_x0000_i1103" style="width:0;height:.75pt" o:hralign="center" o:hrstd="t" o:hr="t" fillcolor="#a0a0a0" stroked="f"/>
+          <v:rect id="_x0000_i1031" style="width:0;height:.75pt" o:hralign="center" o:hrstd="t" o:hr="t" fillcolor="#a0a0a0" stroked="f"/>
         </w:pict>
       </w:r>
     </w:p>
@@ -501,7 +692,246 @@
     </w:p>
     <w:p>
       <w:r>
-        <w:t>MQTT is lightweight, reliable, and designed for IoT communication. It uses minimal bandwidth (important for battery devices) and has built-in quality of service levels. AWS IoT Core handles the complex scaling automatically.</w:t>
+        <w:t>MQTT is lightweight, reliable, and designed for IoT communication. It uses minimal bandwidth (important for battery devices) and has built-in quality of service levels. AWS IoT Core handles </w:t>
+      </w:r>
+      <w:proofErr w:type="gramStart"/>
+      <w:r>
+        <w:t>the complex</w:t>
+      </w:r>
+      <w:proofErr w:type="gramEnd"/>
+      <w:r>
+        <w:t xml:space="preserve"> scaling automatically.</w:t>
+      </w:r>
+    </w:p>
+    <w:p>
+      <w:pPr>
+        <w:rPr>
+          <w:b/>
+          <w:bCs/>
+        </w:rPr>
+      </w:pPr>
+      <w:r>
+        <w:rPr>
+          <w:b/>
+          <w:bCs/>
+        </w:rPr>
+        <w:t>Troubleshooting process:</w:t>
+      </w:r>
+    </w:p>
+    <w:p>
+      <w:r>
+        <w:t>Initial connection failures were resolved by updating IoT policies to include:</w:t>
+      </w:r>
+    </w:p>
+    <w:p>
+      <w:pPr>
+        <w:numPr>
+          <w:ilvl w:val="0"/>
+          <w:numId w:val="54"/>
+        </w:numPr>
+      </w:pPr>
+      <w:proofErr w:type="spellStart"/>
+      <w:proofErr w:type="gramStart"/>
+      <w:r>
+        <w:t>iot:Connect</w:t>
+      </w:r>
+      <w:proofErr w:type="spellEnd"/>
+      <w:proofErr w:type="gramEnd"/>
+      <w:r>
+        <w:t> - Allow device connection</w:t>
+      </w:r>
+    </w:p>
+    <w:p>
+      <w:pPr>
+        <w:numPr>
+          <w:ilvl w:val="0"/>
+          <w:numId w:val="55"/>
+        </w:numPr>
+      </w:pPr>
+      <w:proofErr w:type="spellStart"/>
+      <w:proofErr w:type="gramStart"/>
+      <w:r>
+        <w:t>iot:Publish</w:t>
+      </w:r>
+      <w:proofErr w:type="spellEnd"/>
+      <w:proofErr w:type="gramEnd"/>
+      <w:r>
+        <w:t> - Allow data transmission</w:t>
+      </w:r>
+    </w:p>
+    <w:p>
+      <w:pPr>
+        <w:numPr>
+          <w:ilvl w:val="0"/>
+          <w:numId w:val="56"/>
+        </w:numPr>
+      </w:pPr>
+      <w:proofErr w:type="spellStart"/>
+      <w:proofErr w:type="gramStart"/>
+      <w:r>
+        <w:t>iot:Subscribe</w:t>
+      </w:r>
+      <w:proofErr w:type="spellEnd"/>
+      <w:proofErr w:type="gramEnd"/>
+      <w:r>
+        <w:t> - Allow receiving commands</w:t>
+      </w:r>
+    </w:p>
+    <w:p>
+      <w:r>
+        <w:pict w14:anchorId="429CF43C">
+          <v:rect id="_x0000_i1032" style="width:0;height:.75pt" o:hralign="center" o:hrstd="t" o:hr="t" fillcolor="#a0a0a0" stroked="f"/>
+        </w:pict>
+      </w:r>
+    </w:p>
+    <w:p>
+      <w:pPr>
+        <w:rPr>
+          <w:b/>
+          <w:bCs/>
+        </w:rPr>
+      </w:pPr>
+      <w:r>
+        <w:rPr>
+          <w:b/>
+          <w:bCs/>
+        </w:rPr>
+        <w:t>Day 6: Automated Data Processing</w:t>
+      </w:r>
+    </w:p>
+    <w:p>
+      <w:r>
+        <w:rPr>
+          <w:b/>
+          <w:bCs/>
+        </w:rPr>
+        <w:t>What we did:</w:t>
+      </w:r>
+    </w:p>
+    <w:p>
+      <w:pPr>
+        <w:numPr>
+          <w:ilvl w:val="0"/>
+          <w:numId w:val="57"/>
+        </w:numPr>
+      </w:pPr>
+      <w:r>
+        <w:t>Created DynamoDB table with optimized schema (</w:t>
+      </w:r>
+      <w:proofErr w:type="spellStart"/>
+      <w:r>
+        <w:t>deviceId</w:t>
+      </w:r>
+      <w:proofErr w:type="spellEnd"/>
+      <w:r>
+        <w:t xml:space="preserve"> + timestamp)</w:t>
+      </w:r>
+      <w:r>
+        <w:t xml:space="preserve"> (Picture 7)</w:t>
+      </w:r>
+    </w:p>
+    <w:p>
+      <w:pPr>
+        <w:numPr>
+          <w:ilvl w:val="0"/>
+          <w:numId w:val="58"/>
+        </w:numPr>
+      </w:pPr>
+      <w:r>
+        <w:t>Implemented AWS IoT Rule for automatic data routing</w:t>
+      </w:r>
+    </w:p>
+    <w:p>
+      <w:pPr>
+        <w:numPr>
+          <w:ilvl w:val="0"/>
+          <w:numId w:val="59"/>
+        </w:numPr>
+      </w:pPr>
+      <w:r>
+        <w:t>Set up CloudWatch Logs for real-time monitoring</w:t>
+      </w:r>
+      <w:r>
+        <w:t xml:space="preserve"> and tested with simulated light sensor created in Day 4 (Picture 8)</w:t>
+      </w:r>
+    </w:p>
+    <w:p>
+      <w:r>
+        <w:rPr>
+          <w:b/>
+          <w:bCs/>
+        </w:rPr>
+        <w:t>Database design rationale:</w:t>
+      </w:r>
+    </w:p>
+    <w:p>
+      <w:pPr>
+        <w:numPr>
+          <w:ilvl w:val="0"/>
+          <w:numId w:val="60"/>
+        </w:numPr>
+      </w:pPr>
+      <w:r>
+        <w:rPr>
+          <w:b/>
+          <w:bCs/>
+        </w:rPr>
+        <w:t>Partition Key (</w:t>
+      </w:r>
+      <w:proofErr w:type="spellStart"/>
+      <w:r>
+        <w:rPr>
+          <w:b/>
+          <w:bCs/>
+        </w:rPr>
+        <w:t>deviceId</w:t>
+      </w:r>
+      <w:proofErr w:type="spellEnd"/>
+      <w:r>
+        <w:rPr>
+          <w:b/>
+          <w:bCs/>
+        </w:rPr>
+        <w:t>)</w:t>
+      </w:r>
+      <w:r>
+        <w:t>: Enables efficient queries by device</w:t>
+      </w:r>
+    </w:p>
+    <w:p>
+      <w:pPr>
+        <w:numPr>
+          <w:ilvl w:val="0"/>
+          <w:numId w:val="61"/>
+        </w:numPr>
+      </w:pPr>
+      <w:r>
+        <w:rPr>
+          <w:b/>
+          <w:bCs/>
+        </w:rPr>
+        <w:t>Sort Key (timestamp)</w:t>
+      </w:r>
+      <w:r>
+        <w:t>: Supports chronological data retrieval and time-range queries</w:t>
+      </w:r>
+    </w:p>
+    <w:p>
+      <w:pPr>
+        <w:numPr>
+          <w:ilvl w:val="0"/>
+          <w:numId w:val="62"/>
+        </w:numPr>
+      </w:pPr>
+      <w:r>
+        <w:rPr>
+          <w:b/>
+          <w:bCs/>
+        </w:rPr>
+        <w:t>On-demand billing</w:t>
+      </w:r>
+      <w:r>
+        <w:t>: Scales automatically with data volume</w:t>
       </w:r>
     </w:p>
     <w:p>
@@ -517,209 +947,93 @@
           <w:bCs/>
         </w:rPr>
         <w:lastRenderedPageBreak/>
-        <w:t>Troubleshooting process:</w:t>
+        <w:t>IoT Rule implementation:</w:t>
       </w:r>
     </w:p>
     <w:p>
       <w:r>
-        <w:t>Initial connection failures were resolved by updating IoT policies to include:</w:t>
-      </w:r>
-    </w:p>
-    <w:p>
-      <w:pPr>
-        <w:numPr>
-          <w:ilvl w:val="0"/>
-          <w:numId w:val="54"/>
-        </w:numPr>
-      </w:pPr>
-      <w:r>
-        <w:t>iot:Connect - Allow device connection</w:t>
-      </w:r>
-    </w:p>
-    <w:p>
-      <w:pPr>
-        <w:numPr>
-          <w:ilvl w:val="0"/>
-          <w:numId w:val="55"/>
-        </w:numPr>
-      </w:pPr>
-      <w:r>
-        <w:t>iot:Publish - Allow data transmission</w:t>
-      </w:r>
-    </w:p>
-    <w:p>
-      <w:pPr>
-        <w:numPr>
-          <w:ilvl w:val="0"/>
-          <w:numId w:val="56"/>
-        </w:numPr>
-      </w:pPr>
-      <w:r>
-        <w:t>iot:Subscribe - Allow receiving commands</w:t>
-      </w:r>
-    </w:p>
-    <w:p>
-      <w:r>
-        <w:pict w14:anchorId="429CF43C">
-          <v:rect id="_x0000_i1104" style="width:0;height:.75pt" o:hralign="center" o:hrstd="t" o:hr="t" fillcolor="#a0a0a0" stroked="f"/>
-        </w:pict>
-      </w:r>
-    </w:p>
-    <w:p>
-      <w:pPr>
-        <w:rPr>
-          <w:b/>
-          <w:bCs/>
-        </w:rPr>
-      </w:pPr>
-      <w:r>
-        <w:rPr>
-          <w:b/>
-          <w:bCs/>
-        </w:rPr>
-        <w:t>Day 6: Automated Data Processing</w:t>
-      </w:r>
-    </w:p>
-    <w:p>
-      <w:r>
-        <w:rPr>
-          <w:b/>
-          <w:bCs/>
-        </w:rPr>
-        <w:t>What we did:</w:t>
-      </w:r>
-    </w:p>
-    <w:p>
-      <w:pPr>
-        <w:numPr>
-          <w:ilvl w:val="0"/>
-          <w:numId w:val="57"/>
-        </w:numPr>
-      </w:pPr>
-      <w:r>
-        <w:t>Created DynamoDB table with optimized schema (deviceId + timestamp)</w:t>
-      </w:r>
-      <w:r>
-        <w:t xml:space="preserve"> (Picture 7)</w:t>
-      </w:r>
-    </w:p>
-    <w:p>
-      <w:pPr>
-        <w:numPr>
-          <w:ilvl w:val="0"/>
-          <w:numId w:val="58"/>
-        </w:numPr>
-      </w:pPr>
-      <w:r>
-        <w:t>Implemented AWS IoT Rule for automatic data routing</w:t>
-      </w:r>
-    </w:p>
-    <w:p>
-      <w:pPr>
-        <w:numPr>
-          <w:ilvl w:val="0"/>
-          <w:numId w:val="59"/>
-        </w:numPr>
-      </w:pPr>
-      <w:r>
-        <w:t>Set up CloudWatch Logs for real-time monitoring</w:t>
-      </w:r>
-      <w:r>
-        <w:t xml:space="preserve"> and tested with simulated light sensor created in Day 4 (Picture 8)</w:t>
-      </w:r>
-    </w:p>
-    <w:p>
-      <w:r>
-        <w:rPr>
-          <w:b/>
-          <w:bCs/>
-        </w:rPr>
-        <w:t>Database design rationale:</w:t>
-      </w:r>
-    </w:p>
-    <w:p>
-      <w:pPr>
-        <w:numPr>
-          <w:ilvl w:val="0"/>
-          <w:numId w:val="60"/>
-        </w:numPr>
-      </w:pPr>
-      <w:r>
-        <w:rPr>
-          <w:b/>
-          <w:bCs/>
-        </w:rPr>
-        <w:t>Partition Key (deviceId)</w:t>
-      </w:r>
-      <w:r>
-        <w:t>: Enables efficient queries by device</w:t>
-      </w:r>
-    </w:p>
-    <w:p>
-      <w:pPr>
-        <w:numPr>
-          <w:ilvl w:val="0"/>
-          <w:numId w:val="61"/>
-        </w:numPr>
-      </w:pPr>
-      <w:r>
-        <w:rPr>
-          <w:b/>
-          <w:bCs/>
-        </w:rPr>
-        <w:t>Sort Key (timestamp)</w:t>
-      </w:r>
-      <w:r>
-        <w:t>: Supports chronological data retrieval and time-range queries</w:t>
-      </w:r>
-    </w:p>
-    <w:p>
-      <w:pPr>
-        <w:numPr>
-          <w:ilvl w:val="0"/>
-          <w:numId w:val="62"/>
-        </w:numPr>
-      </w:pPr>
-      <w:r>
-        <w:rPr>
-          <w:b/>
-          <w:bCs/>
-        </w:rPr>
-        <w:t>On-demand billing</w:t>
-      </w:r>
-      <w:r>
-        <w:t>: Scales automatically with data volume</w:t>
-      </w:r>
-    </w:p>
-    <w:p>
-      <w:pPr>
-        <w:rPr>
-          <w:b/>
-          <w:bCs/>
-        </w:rPr>
-      </w:pPr>
-      <w:r>
-        <w:rPr>
-          <w:b/>
-          <w:bCs/>
-        </w:rPr>
-        <w:t>IoT Rule implementation:</w:t>
-      </w:r>
-    </w:p>
-    <w:p>
-      <w:r>
-        <w:t>The SensorDataLogger rule automatically captures all sensor data and routes it to CloudWatch Logs. This provides immediate visibility into system operation and enables rapid troubleshooting.</w:t>
+        <w:t>The </w:t>
+      </w:r>
+      <w:proofErr w:type="spellStart"/>
+      <w:r>
+        <w:t>SensorDataLogger</w:t>
+      </w:r>
+      <w:proofErr w:type="spellEnd"/>
+      <w:r>
+        <w:t> rule automatically captures all sensor data and routes it to CloudWatch Logs. This provides immediate visibility into system operation and enables rapid troubleshooting.</w:t>
       </w:r>
     </w:p>
     <w:p/>
     <w:p>
       <w:r>
-        <w:t>Screenshots</w:t>
+        <w:t>Current Data Flow Pipeline</w:t>
       </w:r>
     </w:p>
     <w:p>
-      <w:r>
-        <w:lastRenderedPageBreak/>
+      <w:pPr>
+        <w:pBdr>
+          <w:top w:val="single" w:sz="4" w:space="1" w:color="auto"/>
+          <w:left w:val="single" w:sz="4" w:space="4" w:color="auto"/>
+          <w:bottom w:val="single" w:sz="4" w:space="1" w:color="auto"/>
+          <w:right w:val="single" w:sz="4" w:space="4" w:color="auto"/>
+        </w:pBdr>
+      </w:pPr>
+      <w:r>
+        <w:t>Sensor Simulator → MQTT → AWS IoT Core → IoT Rule → CloudWatch Logs</w:t>
+      </w:r>
+    </w:p>
+    <w:p>
+      <w:pPr>
+        <w:pBdr>
+          <w:top w:val="single" w:sz="4" w:space="1" w:color="auto"/>
+          <w:left w:val="single" w:sz="4" w:space="4" w:color="auto"/>
+          <w:bottom w:val="single" w:sz="4" w:space="1" w:color="auto"/>
+          <w:right w:val="single" w:sz="4" w:space="4" w:color="auto"/>
+        </w:pBdr>
+      </w:pPr>
+      <w:r>
+        <w:t xml:space="preserve">                                    </w:t>
+      </w:r>
+      <w:r>
+        <w:tab/>
+      </w:r>
+      <w:r>
+        <w:tab/>
+      </w:r>
+      <w:r>
+        <w:tab/>
+      </w:r>
+    </w:p>
+    <w:p>
+      <w:pPr>
+        <w:pBdr>
+          <w:top w:val="single" w:sz="4" w:space="1" w:color="auto"/>
+          <w:left w:val="single" w:sz="4" w:space="4" w:color="auto"/>
+          <w:bottom w:val="single" w:sz="4" w:space="1" w:color="auto"/>
+          <w:right w:val="single" w:sz="4" w:space="4" w:color="auto"/>
+        </w:pBdr>
+      </w:pPr>
+      <w:r>
+        <w:t xml:space="preserve">                              </w:t>
+      </w:r>
+      <w:r>
+        <w:tab/>
+      </w:r>
+      <w:r>
+        <w:tab/>
+        <w:t>DynamoDB (Ready)</w:t>
+      </w:r>
+    </w:p>
+    <w:p>
+      <w:r>
+        <w:t>Screenshots</w:t>
+      </w:r>
+    </w:p>
+    <w:p>
+      <w:r>
+        <w:rPr>
+          <w:noProof/>
+        </w:rPr>
         <w:drawing>
           <wp:inline distT="0" distB="0" distL="0" distR="0" wp14:anchorId="4556FF67" wp14:editId="2E867092">
             <wp:extent cx="5943600" cy="2898140"/>
@@ -775,6 +1089,7 @@
         <w:rPr>
           <w:noProof/>
         </w:rPr>
+        <w:lastRenderedPageBreak/>
         <w:drawing>
           <wp:inline distT="0" distB="0" distL="0" distR="0" wp14:anchorId="4F0BA540" wp14:editId="00B83946">
             <wp:extent cx="5943600" cy="3372485"/>
@@ -822,7 +1137,9 @@
     </w:p>
     <w:p>
       <w:r>
-        <w:lastRenderedPageBreak/>
+        <w:rPr>
+          <w:noProof/>
+        </w:rPr>
         <w:drawing>
           <wp:inline distT="0" distB="0" distL="0" distR="0" wp14:anchorId="360230AE" wp14:editId="0447B183">
             <wp:extent cx="5943600" cy="1152525"/>
@@ -888,6 +1205,9 @@
     </w:p>
     <w:p>
       <w:r>
+        <w:rPr>
+          <w:noProof/>
+        </w:rPr>
         <w:drawing>
           <wp:inline distT="0" distB="0" distL="0" distR="0" wp14:anchorId="238DC3D8" wp14:editId="090BEE64">
             <wp:extent cx="5943600" cy="2574290"/>
@@ -930,6 +1250,7 @@
         <w:jc w:val="center"/>
       </w:pPr>
       <w:r>
+        <w:lastRenderedPageBreak/>
         <w:t>Picture 4 – Successfully generated payload and sent to AWS</w:t>
       </w:r>
       <w:r>
@@ -938,6 +1259,9 @@
     </w:p>
     <w:p>
       <w:r>
+        <w:rPr>
+          <w:noProof/>
+        </w:rPr>
         <w:drawing>
           <wp:inline distT="0" distB="0" distL="0" distR="0" wp14:anchorId="68868FB0" wp14:editId="7272914A">
             <wp:extent cx="5943600" cy="2089150"/>
@@ -985,7 +1309,9 @@
     </w:p>
     <w:p>
       <w:r>
-        <w:lastRenderedPageBreak/>
+        <w:rPr>
+          <w:noProof/>
+        </w:rPr>
         <w:drawing>
           <wp:inline distT="0" distB="0" distL="0" distR="0" wp14:anchorId="5FB8C1A1" wp14:editId="00B22E1F">
             <wp:extent cx="5943600" cy="2486025"/>
@@ -1039,6 +1365,10 @@
     </w:p>
     <w:p>
       <w:r>
+        <w:rPr>
+          <w:noProof/>
+        </w:rPr>
+        <w:lastRenderedPageBreak/>
         <w:drawing>
           <wp:inline distT="0" distB="0" distL="0" distR="0" wp14:anchorId="65348925" wp14:editId="1E5070C5">
             <wp:extent cx="5943600" cy="2664460"/>
@@ -1081,12 +1411,22 @@
         <w:jc w:val="center"/>
       </w:pPr>
       <w:r>
-        <w:t>Picture 7 – Create SensorData Table on DynamoDB</w:t>
+        <w:t xml:space="preserve">Picture 7 – Create </w:t>
+      </w:r>
+      <w:proofErr w:type="spellStart"/>
+      <w:r>
+        <w:t>SensorData</w:t>
+      </w:r>
+      <w:proofErr w:type="spellEnd"/>
+      <w:r>
+        <w:t xml:space="preserve"> Table on DynamoDB</w:t>
       </w:r>
     </w:p>
     <w:p>
       <w:r>
-        <w:lastRenderedPageBreak/>
+        <w:rPr>
+          <w:noProof/>
+        </w:rPr>
         <w:drawing>
           <wp:inline distT="0" distB="0" distL="0" distR="0" wp14:anchorId="2D6F7F08" wp14:editId="4B7EEB59">
             <wp:extent cx="5943600" cy="2892425"/>
@@ -1138,7 +1478,207 @@
         <w:t xml:space="preserve"> on CloudWatch Logs.</w:t>
       </w:r>
     </w:p>
-    <w:p/>
+    <w:p>
+      <w:r>
+        <w:rPr>
+          <w:noProof/>
+        </w:rPr>
+        <w:lastRenderedPageBreak/>
+        <w:drawing>
+          <wp:inline distT="0" distB="0" distL="0" distR="0" wp14:anchorId="102D7723" wp14:editId="614EDEDA">
+            <wp:extent cx="5943600" cy="2809240"/>
+            <wp:effectExtent l="0" t="0" r="0" b="0"/>
+            <wp:docPr id="2054708279" name="Picture 1" descr="A screenshot of a computer&#10;&#10;AI-generated content may be incorrect."/>
+            <wp:cNvGraphicFramePr>
+              <a:graphicFrameLocks xmlns:a="http://schemas.openxmlformats.org/drawingml/2006/main" noChangeAspect="1"/>
+            </wp:cNvGraphicFramePr>
+            <a:graphic xmlns:a="http://schemas.openxmlformats.org/drawingml/2006/main">
+              <a:graphicData uri="http://schemas.openxmlformats.org/drawingml/2006/picture">
+                <pic:pic xmlns:pic="http://schemas.openxmlformats.org/drawingml/2006/picture">
+                  <pic:nvPicPr>
+                    <pic:cNvPr id="2054708279" name="Picture 1" descr="A screenshot of a computer&#10;&#10;AI-generated content may be incorrect."/>
+                    <pic:cNvPicPr/>
+                  </pic:nvPicPr>
+                  <pic:blipFill>
+                    <a:blip r:embed="rId13"/>
+                    <a:stretch>
+                      <a:fillRect/>
+                    </a:stretch>
+                  </pic:blipFill>
+                  <pic:spPr>
+                    <a:xfrm>
+                      <a:off x="0" y="0"/>
+                      <a:ext cx="5943600" cy="2809240"/>
+                    </a:xfrm>
+                    <a:prstGeom prst="rect">
+                      <a:avLst/>
+                    </a:prstGeom>
+                  </pic:spPr>
+                </pic:pic>
+              </a:graphicData>
+            </a:graphic>
+          </wp:inline>
+        </w:drawing>
+      </w:r>
+    </w:p>
+    <w:p>
+      <w:r>
+        <w:t>Picture 9 – Successfully displayed the sent payload on DynamoDB “</w:t>
+      </w:r>
+      <w:proofErr w:type="spellStart"/>
+      <w:r>
+        <w:t>SensorData</w:t>
+      </w:r>
+      <w:proofErr w:type="spellEnd"/>
+      <w:r>
+        <w:t>” Table.</w:t>
+      </w:r>
+    </w:p>
+    <w:p>
+      <w:r>
+        <w:rPr>
+          <w:noProof/>
+        </w:rPr>
+        <w:drawing>
+          <wp:inline distT="0" distB="0" distL="0" distR="0" wp14:anchorId="3105EE85" wp14:editId="04D763F0">
+            <wp:extent cx="5943600" cy="2884170"/>
+            <wp:effectExtent l="0" t="0" r="0" b="0"/>
+            <wp:docPr id="312782182" name="Picture 1" descr="A screenshot of a computer&#10;&#10;AI-generated content may be incorrect."/>
+            <wp:cNvGraphicFramePr>
+              <a:graphicFrameLocks xmlns:a="http://schemas.openxmlformats.org/drawingml/2006/main" noChangeAspect="1"/>
+            </wp:cNvGraphicFramePr>
+            <a:graphic xmlns:a="http://schemas.openxmlformats.org/drawingml/2006/main">
+              <a:graphicData uri="http://schemas.openxmlformats.org/drawingml/2006/picture">
+                <pic:pic xmlns:pic="http://schemas.openxmlformats.org/drawingml/2006/picture">
+                  <pic:nvPicPr>
+                    <pic:cNvPr id="312782182" name="Picture 1" descr="A screenshot of a computer&#10;&#10;AI-generated content may be incorrect."/>
+                    <pic:cNvPicPr/>
+                  </pic:nvPicPr>
+                  <pic:blipFill>
+                    <a:blip r:embed="rId14"/>
+                    <a:stretch>
+                      <a:fillRect/>
+                    </a:stretch>
+                  </pic:blipFill>
+                  <pic:spPr>
+                    <a:xfrm>
+                      <a:off x="0" y="0"/>
+                      <a:ext cx="5943600" cy="2884170"/>
+                    </a:xfrm>
+                    <a:prstGeom prst="rect">
+                      <a:avLst/>
+                    </a:prstGeom>
+                  </pic:spPr>
+                </pic:pic>
+              </a:graphicData>
+            </a:graphic>
+          </wp:inline>
+        </w:drawing>
+      </w:r>
+    </w:p>
+    <w:p>
+      <w:r>
+        <w:t xml:space="preserve">Picture 10 </w:t>
+      </w:r>
+      <w:r>
+        <w:t>–</w:t>
+      </w:r>
+      <w:r>
+        <w:t xml:space="preserve"> </w:t>
+      </w:r>
+    </w:p>
+    <w:p>
+      <w:r>
+        <w:rPr>
+          <w:noProof/>
+        </w:rPr>
+        <w:lastRenderedPageBreak/>
+        <w:drawing>
+          <wp:inline distT="0" distB="0" distL="0" distR="0" wp14:anchorId="00C74E14" wp14:editId="33AEF751">
+            <wp:extent cx="5943600" cy="2887980"/>
+            <wp:effectExtent l="0" t="0" r="0" b="7620"/>
+            <wp:docPr id="829328025" name="Picture 1" descr="A screenshot of a computer&#10;&#10;AI-generated content may be incorrect."/>
+            <wp:cNvGraphicFramePr>
+              <a:graphicFrameLocks xmlns:a="http://schemas.openxmlformats.org/drawingml/2006/main" noChangeAspect="1"/>
+            </wp:cNvGraphicFramePr>
+            <a:graphic xmlns:a="http://schemas.openxmlformats.org/drawingml/2006/main">
+              <a:graphicData uri="http://schemas.openxmlformats.org/drawingml/2006/picture">
+                <pic:pic xmlns:pic="http://schemas.openxmlformats.org/drawingml/2006/picture">
+                  <pic:nvPicPr>
+                    <pic:cNvPr id="829328025" name="Picture 1" descr="A screenshot of a computer&#10;&#10;AI-generated content may be incorrect."/>
+                    <pic:cNvPicPr/>
+                  </pic:nvPicPr>
+                  <pic:blipFill>
+                    <a:blip r:embed="rId15"/>
+                    <a:stretch>
+                      <a:fillRect/>
+                    </a:stretch>
+                  </pic:blipFill>
+                  <pic:spPr>
+                    <a:xfrm>
+                      <a:off x="0" y="0"/>
+                      <a:ext cx="5943600" cy="2887980"/>
+                    </a:xfrm>
+                    <a:prstGeom prst="rect">
+                      <a:avLst/>
+                    </a:prstGeom>
+                  </pic:spPr>
+                </pic:pic>
+              </a:graphicData>
+            </a:graphic>
+          </wp:inline>
+        </w:drawing>
+      </w:r>
+    </w:p>
+    <w:p>
+      <w:r>
+        <w:t>Picture 11 – Successfully displayed the payload to node-RED</w:t>
+      </w:r>
+    </w:p>
+    <w:p>
+      <w:r>
+        <w:drawing>
+          <wp:inline distT="0" distB="0" distL="0" distR="0" wp14:anchorId="7930CB8B" wp14:editId="2ACF4E05">
+            <wp:extent cx="5943600" cy="3010535"/>
+            <wp:effectExtent l="0" t="0" r="0" b="0"/>
+            <wp:docPr id="1471398110" name="Picture 1" descr="A screenshot of a computer&#10;&#10;AI-generated content may be incorrect."/>
+            <wp:cNvGraphicFramePr>
+              <a:graphicFrameLocks xmlns:a="http://schemas.openxmlformats.org/drawingml/2006/main" noChangeAspect="1"/>
+            </wp:cNvGraphicFramePr>
+            <a:graphic xmlns:a="http://schemas.openxmlformats.org/drawingml/2006/main">
+              <a:graphicData uri="http://schemas.openxmlformats.org/drawingml/2006/picture">
+                <pic:pic xmlns:pic="http://schemas.openxmlformats.org/drawingml/2006/picture">
+                  <pic:nvPicPr>
+                    <pic:cNvPr id="1471398110" name="Picture 1" descr="A screenshot of a computer&#10;&#10;AI-generated content may be incorrect."/>
+                    <pic:cNvPicPr/>
+                  </pic:nvPicPr>
+                  <pic:blipFill>
+                    <a:blip r:embed="rId16"/>
+                    <a:stretch>
+                      <a:fillRect/>
+                    </a:stretch>
+                  </pic:blipFill>
+                  <pic:spPr>
+                    <a:xfrm>
+                      <a:off x="0" y="0"/>
+                      <a:ext cx="5943600" cy="3010535"/>
+                    </a:xfrm>
+                    <a:prstGeom prst="rect">
+                      <a:avLst/>
+                    </a:prstGeom>
+                  </pic:spPr>
+                </pic:pic>
+              </a:graphicData>
+            </a:graphic>
+          </wp:inline>
+        </w:drawing>
+      </w:r>
+    </w:p>
+    <w:p>
+      <w:r>
+        <w:t>Picture 12 – Successfully install function node that handle turn light logic</w:t>
+      </w:r>
+    </w:p>
     <w:sectPr>
       <w:pgSz w:w="12240" w:h="15840"/>
       <w:pgMar w:top="1440" w:right="1440" w:bottom="1440" w:left="1440" w:header="720" w:footer="720" w:gutter="0"/>
@@ -1599,6 +2139,155 @@
     </w:lvl>
   </w:abstractNum>
   <w:abstractNum w:abstractNumId="3" w15:restartNumberingAfterBreak="0">
+    <w:nsid w:val="09E1272B"/>
+    <w:multiLevelType w:val="multilevel"/>
+    <w:tmpl w:val="AF1E861C"/>
+    <w:lvl w:ilvl="0">
+      <w:start w:val="1"/>
+      <w:numFmt w:val="bullet"/>
+      <w:lvlText w:val=""/>
+      <w:lvlJc w:val="left"/>
+      <w:pPr>
+        <w:tabs>
+          <w:tab w:val="num" w:pos="720"/>
+        </w:tabs>
+        <w:ind w:left="720" w:hanging="360"/>
+      </w:pPr>
+      <w:rPr>
+        <w:rFonts w:ascii="Symbol" w:hAnsi="Symbol" w:hint="default"/>
+        <w:sz w:val="20"/>
+      </w:rPr>
+    </w:lvl>
+    <w:lvl w:ilvl="1" w:tentative="1">
+      <w:start w:val="1"/>
+      <w:numFmt w:val="bullet"/>
+      <w:lvlText w:val="o"/>
+      <w:lvlJc w:val="left"/>
+      <w:pPr>
+        <w:tabs>
+          <w:tab w:val="num" w:pos="1440"/>
+        </w:tabs>
+        <w:ind w:left="1440" w:hanging="360"/>
+      </w:pPr>
+      <w:rPr>
+        <w:rFonts w:ascii="Courier New" w:hAnsi="Courier New" w:hint="default"/>
+        <w:sz w:val="20"/>
+      </w:rPr>
+    </w:lvl>
+    <w:lvl w:ilvl="2" w:tentative="1">
+      <w:start w:val="1"/>
+      <w:numFmt w:val="bullet"/>
+      <w:lvlText w:val=""/>
+      <w:lvlJc w:val="left"/>
+      <w:pPr>
+        <w:tabs>
+          <w:tab w:val="num" w:pos="2160"/>
+        </w:tabs>
+        <w:ind w:left="2160" w:hanging="360"/>
+      </w:pPr>
+      <w:rPr>
+        <w:rFonts w:ascii="Wingdings" w:hAnsi="Wingdings" w:hint="default"/>
+        <w:sz w:val="20"/>
+      </w:rPr>
+    </w:lvl>
+    <w:lvl w:ilvl="3" w:tentative="1">
+      <w:start w:val="1"/>
+      <w:numFmt w:val="bullet"/>
+      <w:lvlText w:val=""/>
+      <w:lvlJc w:val="left"/>
+      <w:pPr>
+        <w:tabs>
+          <w:tab w:val="num" w:pos="2880"/>
+        </w:tabs>
+        <w:ind w:left="2880" w:hanging="360"/>
+      </w:pPr>
+      <w:rPr>
+        <w:rFonts w:ascii="Wingdings" w:hAnsi="Wingdings" w:hint="default"/>
+        <w:sz w:val="20"/>
+      </w:rPr>
+    </w:lvl>
+    <w:lvl w:ilvl="4" w:tentative="1">
+      <w:start w:val="1"/>
+      <w:numFmt w:val="bullet"/>
+      <w:lvlText w:val=""/>
+      <w:lvlJc w:val="left"/>
+      <w:pPr>
+        <w:tabs>
+          <w:tab w:val="num" w:pos="3600"/>
+        </w:tabs>
+        <w:ind w:left="3600" w:hanging="360"/>
+      </w:pPr>
+      <w:rPr>
+        <w:rFonts w:ascii="Wingdings" w:hAnsi="Wingdings" w:hint="default"/>
+        <w:sz w:val="20"/>
+      </w:rPr>
+    </w:lvl>
+    <w:lvl w:ilvl="5" w:tentative="1">
+      <w:start w:val="1"/>
+      <w:numFmt w:val="bullet"/>
+      <w:lvlText w:val=""/>
+      <w:lvlJc w:val="left"/>
+      <w:pPr>
+        <w:tabs>
+          <w:tab w:val="num" w:pos="4320"/>
+        </w:tabs>
+        <w:ind w:left="4320" w:hanging="360"/>
+      </w:pPr>
+      <w:rPr>
+        <w:rFonts w:ascii="Wingdings" w:hAnsi="Wingdings" w:hint="default"/>
+        <w:sz w:val="20"/>
+      </w:rPr>
+    </w:lvl>
+    <w:lvl w:ilvl="6" w:tentative="1">
+      <w:start w:val="1"/>
+      <w:numFmt w:val="bullet"/>
+      <w:lvlText w:val=""/>
+      <w:lvlJc w:val="left"/>
+      <w:pPr>
+        <w:tabs>
+          <w:tab w:val="num" w:pos="5040"/>
+        </w:tabs>
+        <w:ind w:left="5040" w:hanging="360"/>
+      </w:pPr>
+      <w:rPr>
+        <w:rFonts w:ascii="Wingdings" w:hAnsi="Wingdings" w:hint="default"/>
+        <w:sz w:val="20"/>
+      </w:rPr>
+    </w:lvl>
+    <w:lvl w:ilvl="7" w:tentative="1">
+      <w:start w:val="1"/>
+      <w:numFmt w:val="bullet"/>
+      <w:lvlText w:val=""/>
+      <w:lvlJc w:val="left"/>
+      <w:pPr>
+        <w:tabs>
+          <w:tab w:val="num" w:pos="5760"/>
+        </w:tabs>
+        <w:ind w:left="5760" w:hanging="360"/>
+      </w:pPr>
+      <w:rPr>
+        <w:rFonts w:ascii="Wingdings" w:hAnsi="Wingdings" w:hint="default"/>
+        <w:sz w:val="20"/>
+      </w:rPr>
+    </w:lvl>
+    <w:lvl w:ilvl="8" w:tentative="1">
+      <w:start w:val="1"/>
+      <w:numFmt w:val="bullet"/>
+      <w:lvlText w:val=""/>
+      <w:lvlJc w:val="left"/>
+      <w:pPr>
+        <w:tabs>
+          <w:tab w:val="num" w:pos="6480"/>
+        </w:tabs>
+        <w:ind w:left="6480" w:hanging="360"/>
+      </w:pPr>
+      <w:rPr>
+        <w:rFonts w:ascii="Wingdings" w:hAnsi="Wingdings" w:hint="default"/>
+        <w:sz w:val="20"/>
+      </w:rPr>
+    </w:lvl>
+  </w:abstractNum>
+  <w:abstractNum w:abstractNumId="4" w15:restartNumberingAfterBreak="0">
     <w:nsid w:val="0AC9628C"/>
     <w:multiLevelType w:val="multilevel"/>
     <w:tmpl w:val="BA62F462"/>
@@ -1747,7 +2436,7 @@
       </w:rPr>
     </w:lvl>
   </w:abstractNum>
-  <w:abstractNum w:abstractNumId="4" w15:restartNumberingAfterBreak="0">
+  <w:abstractNum w:abstractNumId="5" w15:restartNumberingAfterBreak="0">
     <w:nsid w:val="0D5B7F4A"/>
     <w:multiLevelType w:val="multilevel"/>
     <w:tmpl w:val="1A84BA6E"/>
@@ -1896,7 +2585,7 @@
       </w:rPr>
     </w:lvl>
   </w:abstractNum>
-  <w:abstractNum w:abstractNumId="5" w15:restartNumberingAfterBreak="0">
+  <w:abstractNum w:abstractNumId="6" w15:restartNumberingAfterBreak="0">
     <w:nsid w:val="0D5C21A6"/>
     <w:multiLevelType w:val="multilevel"/>
     <w:tmpl w:val="0FA6BF52"/>
@@ -2045,7 +2734,7 @@
       </w:rPr>
     </w:lvl>
   </w:abstractNum>
-  <w:abstractNum w:abstractNumId="6" w15:restartNumberingAfterBreak="0">
+  <w:abstractNum w:abstractNumId="7" w15:restartNumberingAfterBreak="0">
     <w:nsid w:val="0E6F78D0"/>
     <w:multiLevelType w:val="multilevel"/>
     <w:tmpl w:val="2D5EF3F4"/>
@@ -2194,7 +2883,7 @@
       </w:rPr>
     </w:lvl>
   </w:abstractNum>
-  <w:abstractNum w:abstractNumId="7" w15:restartNumberingAfterBreak="0">
+  <w:abstractNum w:abstractNumId="8" w15:restartNumberingAfterBreak="0">
     <w:nsid w:val="10E149EA"/>
     <w:multiLevelType w:val="multilevel"/>
     <w:tmpl w:val="9B6E6AE2"/>
@@ -2343,7 +3032,7 @@
       </w:rPr>
     </w:lvl>
   </w:abstractNum>
-  <w:abstractNum w:abstractNumId="8" w15:restartNumberingAfterBreak="0">
+  <w:abstractNum w:abstractNumId="9" w15:restartNumberingAfterBreak="0">
     <w:nsid w:val="1491208B"/>
     <w:multiLevelType w:val="multilevel"/>
     <w:tmpl w:val="52D40EEE"/>
@@ -2492,7 +3181,7 @@
       </w:rPr>
     </w:lvl>
   </w:abstractNum>
-  <w:abstractNum w:abstractNumId="9" w15:restartNumberingAfterBreak="0">
+  <w:abstractNum w:abstractNumId="10" w15:restartNumberingAfterBreak="0">
     <w:nsid w:val="149959FB"/>
     <w:multiLevelType w:val="multilevel"/>
     <w:tmpl w:val="680E6EC0"/>
@@ -2641,7 +3330,7 @@
       </w:rPr>
     </w:lvl>
   </w:abstractNum>
-  <w:abstractNum w:abstractNumId="10" w15:restartNumberingAfterBreak="0">
+  <w:abstractNum w:abstractNumId="11" w15:restartNumberingAfterBreak="0">
     <w:nsid w:val="161B46E7"/>
     <w:multiLevelType w:val="multilevel"/>
     <w:tmpl w:val="BDEA4040"/>
@@ -2790,7 +3479,7 @@
       </w:rPr>
     </w:lvl>
   </w:abstractNum>
-  <w:abstractNum w:abstractNumId="11" w15:restartNumberingAfterBreak="0">
+  <w:abstractNum w:abstractNumId="12" w15:restartNumberingAfterBreak="0">
     <w:nsid w:val="172C2B82"/>
     <w:multiLevelType w:val="multilevel"/>
     <w:tmpl w:val="9ED4A83E"/>
@@ -2939,7 +3628,7 @@
       </w:rPr>
     </w:lvl>
   </w:abstractNum>
-  <w:abstractNum w:abstractNumId="12" w15:restartNumberingAfterBreak="0">
+  <w:abstractNum w:abstractNumId="13" w15:restartNumberingAfterBreak="0">
     <w:nsid w:val="17750AA5"/>
     <w:multiLevelType w:val="multilevel"/>
     <w:tmpl w:val="15ACE1D2"/>
@@ -3088,7 +3777,7 @@
       </w:rPr>
     </w:lvl>
   </w:abstractNum>
-  <w:abstractNum w:abstractNumId="13" w15:restartNumberingAfterBreak="0">
+  <w:abstractNum w:abstractNumId="14" w15:restartNumberingAfterBreak="0">
     <w:nsid w:val="18AD5706"/>
     <w:multiLevelType w:val="multilevel"/>
     <w:tmpl w:val="8384F768"/>
@@ -3237,7 +3926,7 @@
       </w:rPr>
     </w:lvl>
   </w:abstractNum>
-  <w:abstractNum w:abstractNumId="14" w15:restartNumberingAfterBreak="0">
+  <w:abstractNum w:abstractNumId="15" w15:restartNumberingAfterBreak="0">
     <w:nsid w:val="1AC94FA7"/>
     <w:multiLevelType w:val="multilevel"/>
     <w:tmpl w:val="E1BA4FBC"/>
@@ -3386,7 +4075,7 @@
       </w:rPr>
     </w:lvl>
   </w:abstractNum>
-  <w:abstractNum w:abstractNumId="15" w15:restartNumberingAfterBreak="0">
+  <w:abstractNum w:abstractNumId="16" w15:restartNumberingAfterBreak="0">
     <w:nsid w:val="1AE619BF"/>
     <w:multiLevelType w:val="multilevel"/>
     <w:tmpl w:val="D670151C"/>
@@ -3535,7 +4224,7 @@
       </w:rPr>
     </w:lvl>
   </w:abstractNum>
-  <w:abstractNum w:abstractNumId="16" w15:restartNumberingAfterBreak="0">
+  <w:abstractNum w:abstractNumId="17" w15:restartNumberingAfterBreak="0">
     <w:nsid w:val="228908AF"/>
     <w:multiLevelType w:val="multilevel"/>
     <w:tmpl w:val="863AF432"/>
@@ -3684,7 +4373,7 @@
       </w:rPr>
     </w:lvl>
   </w:abstractNum>
-  <w:abstractNum w:abstractNumId="17" w15:restartNumberingAfterBreak="0">
+  <w:abstractNum w:abstractNumId="18" w15:restartNumberingAfterBreak="0">
     <w:nsid w:val="22B76C17"/>
     <w:multiLevelType w:val="multilevel"/>
     <w:tmpl w:val="F69AF4F6"/>
@@ -3833,7 +4522,7 @@
       </w:rPr>
     </w:lvl>
   </w:abstractNum>
-  <w:abstractNum w:abstractNumId="18" w15:restartNumberingAfterBreak="0">
+  <w:abstractNum w:abstractNumId="19" w15:restartNumberingAfterBreak="0">
     <w:nsid w:val="24493780"/>
     <w:multiLevelType w:val="multilevel"/>
     <w:tmpl w:val="AD6EC28C"/>
@@ -3982,7 +4671,7 @@
       </w:rPr>
     </w:lvl>
   </w:abstractNum>
-  <w:abstractNum w:abstractNumId="19" w15:restartNumberingAfterBreak="0">
+  <w:abstractNum w:abstractNumId="20" w15:restartNumberingAfterBreak="0">
     <w:nsid w:val="25A27224"/>
     <w:multiLevelType w:val="multilevel"/>
     <w:tmpl w:val="20105888"/>
@@ -4131,7 +4820,7 @@
       </w:rPr>
     </w:lvl>
   </w:abstractNum>
-  <w:abstractNum w:abstractNumId="20" w15:restartNumberingAfterBreak="0">
+  <w:abstractNum w:abstractNumId="21" w15:restartNumberingAfterBreak="0">
     <w:nsid w:val="29013BC4"/>
     <w:multiLevelType w:val="multilevel"/>
     <w:tmpl w:val="0AF22012"/>
@@ -4280,7 +4969,7 @@
       </w:rPr>
     </w:lvl>
   </w:abstractNum>
-  <w:abstractNum w:abstractNumId="21" w15:restartNumberingAfterBreak="0">
+  <w:abstractNum w:abstractNumId="22" w15:restartNumberingAfterBreak="0">
     <w:nsid w:val="2A0E0C71"/>
     <w:multiLevelType w:val="multilevel"/>
     <w:tmpl w:val="EB04B3C2"/>
@@ -4429,7 +5118,7 @@
       </w:rPr>
     </w:lvl>
   </w:abstractNum>
-  <w:abstractNum w:abstractNumId="22" w15:restartNumberingAfterBreak="0">
+  <w:abstractNum w:abstractNumId="23" w15:restartNumberingAfterBreak="0">
     <w:nsid w:val="2AA007D8"/>
     <w:multiLevelType w:val="multilevel"/>
     <w:tmpl w:val="362C960A"/>
@@ -4578,7 +5267,7 @@
       </w:rPr>
     </w:lvl>
   </w:abstractNum>
-  <w:abstractNum w:abstractNumId="23" w15:restartNumberingAfterBreak="0">
+  <w:abstractNum w:abstractNumId="24" w15:restartNumberingAfterBreak="0">
     <w:nsid w:val="2B255B34"/>
     <w:multiLevelType w:val="multilevel"/>
     <w:tmpl w:val="3D30E948"/>
@@ -4727,7 +5416,7 @@
       </w:rPr>
     </w:lvl>
   </w:abstractNum>
-  <w:abstractNum w:abstractNumId="24" w15:restartNumberingAfterBreak="0">
+  <w:abstractNum w:abstractNumId="25" w15:restartNumberingAfterBreak="0">
     <w:nsid w:val="2D957121"/>
     <w:multiLevelType w:val="multilevel"/>
     <w:tmpl w:val="AE66020C"/>
@@ -4876,7 +5565,7 @@
       </w:rPr>
     </w:lvl>
   </w:abstractNum>
-  <w:abstractNum w:abstractNumId="25" w15:restartNumberingAfterBreak="0">
+  <w:abstractNum w:abstractNumId="26" w15:restartNumberingAfterBreak="0">
     <w:nsid w:val="2E4553BB"/>
     <w:multiLevelType w:val="multilevel"/>
     <w:tmpl w:val="ED4E7E0C"/>
@@ -5025,7 +5714,7 @@
       </w:rPr>
     </w:lvl>
   </w:abstractNum>
-  <w:abstractNum w:abstractNumId="26" w15:restartNumberingAfterBreak="0">
+  <w:abstractNum w:abstractNumId="27" w15:restartNumberingAfterBreak="0">
     <w:nsid w:val="31D60B94"/>
     <w:multiLevelType w:val="hybridMultilevel"/>
     <w:tmpl w:val="CBC0F882"/>
@@ -5138,7 +5827,7 @@
       </w:rPr>
     </w:lvl>
   </w:abstractNum>
-  <w:abstractNum w:abstractNumId="27" w15:restartNumberingAfterBreak="0">
+  <w:abstractNum w:abstractNumId="28" w15:restartNumberingAfterBreak="0">
     <w:nsid w:val="33341D9A"/>
     <w:multiLevelType w:val="multilevel"/>
     <w:tmpl w:val="82A6A45E"/>
@@ -5287,7 +5976,7 @@
       </w:rPr>
     </w:lvl>
   </w:abstractNum>
-  <w:abstractNum w:abstractNumId="28" w15:restartNumberingAfterBreak="0">
+  <w:abstractNum w:abstractNumId="29" w15:restartNumberingAfterBreak="0">
     <w:nsid w:val="34EB4D23"/>
     <w:multiLevelType w:val="multilevel"/>
     <w:tmpl w:val="11DA35AE"/>
@@ -5436,7 +6125,7 @@
       </w:rPr>
     </w:lvl>
   </w:abstractNum>
-  <w:abstractNum w:abstractNumId="29" w15:restartNumberingAfterBreak="0">
+  <w:abstractNum w:abstractNumId="30" w15:restartNumberingAfterBreak="0">
     <w:nsid w:val="373100BF"/>
     <w:multiLevelType w:val="multilevel"/>
     <w:tmpl w:val="ABE27542"/>
@@ -5585,7 +6274,7 @@
       </w:rPr>
     </w:lvl>
   </w:abstractNum>
-  <w:abstractNum w:abstractNumId="30" w15:restartNumberingAfterBreak="0">
+  <w:abstractNum w:abstractNumId="31" w15:restartNumberingAfterBreak="0">
     <w:nsid w:val="379A4D09"/>
     <w:multiLevelType w:val="multilevel"/>
     <w:tmpl w:val="2C02C060"/>
@@ -5734,7 +6423,7 @@
       </w:rPr>
     </w:lvl>
   </w:abstractNum>
-  <w:abstractNum w:abstractNumId="31" w15:restartNumberingAfterBreak="0">
+  <w:abstractNum w:abstractNumId="32" w15:restartNumberingAfterBreak="0">
     <w:nsid w:val="385430B9"/>
     <w:multiLevelType w:val="multilevel"/>
     <w:tmpl w:val="AABA2B62"/>
@@ -5883,7 +6572,7 @@
       </w:rPr>
     </w:lvl>
   </w:abstractNum>
-  <w:abstractNum w:abstractNumId="32" w15:restartNumberingAfterBreak="0">
+  <w:abstractNum w:abstractNumId="33" w15:restartNumberingAfterBreak="0">
     <w:nsid w:val="3BB1305B"/>
     <w:multiLevelType w:val="multilevel"/>
     <w:tmpl w:val="9D101DB4"/>
@@ -6032,7 +6721,7 @@
       </w:rPr>
     </w:lvl>
   </w:abstractNum>
-  <w:abstractNum w:abstractNumId="33" w15:restartNumberingAfterBreak="0">
+  <w:abstractNum w:abstractNumId="34" w15:restartNumberingAfterBreak="0">
     <w:nsid w:val="40140FEE"/>
     <w:multiLevelType w:val="multilevel"/>
     <w:tmpl w:val="9398D196"/>
@@ -6181,7 +6870,7 @@
       </w:rPr>
     </w:lvl>
   </w:abstractNum>
-  <w:abstractNum w:abstractNumId="34" w15:restartNumberingAfterBreak="0">
+  <w:abstractNum w:abstractNumId="35" w15:restartNumberingAfterBreak="0">
     <w:nsid w:val="414C3E45"/>
     <w:multiLevelType w:val="hybridMultilevel"/>
     <w:tmpl w:val="6AB2A3A8"/>
@@ -6294,7 +6983,7 @@
       </w:rPr>
     </w:lvl>
   </w:abstractNum>
-  <w:abstractNum w:abstractNumId="35" w15:restartNumberingAfterBreak="0">
+  <w:abstractNum w:abstractNumId="36" w15:restartNumberingAfterBreak="0">
     <w:nsid w:val="456C03A6"/>
     <w:multiLevelType w:val="multilevel"/>
     <w:tmpl w:val="3FC6EECA"/>
@@ -6443,7 +7132,7 @@
       </w:rPr>
     </w:lvl>
   </w:abstractNum>
-  <w:abstractNum w:abstractNumId="36" w15:restartNumberingAfterBreak="0">
+  <w:abstractNum w:abstractNumId="37" w15:restartNumberingAfterBreak="0">
     <w:nsid w:val="484C6148"/>
     <w:multiLevelType w:val="multilevel"/>
     <w:tmpl w:val="811CB73E"/>
@@ -6592,7 +7281,7 @@
       </w:rPr>
     </w:lvl>
   </w:abstractNum>
-  <w:abstractNum w:abstractNumId="37" w15:restartNumberingAfterBreak="0">
+  <w:abstractNum w:abstractNumId="38" w15:restartNumberingAfterBreak="0">
     <w:nsid w:val="4CEA6050"/>
     <w:multiLevelType w:val="multilevel"/>
     <w:tmpl w:val="37AE8B50"/>
@@ -6741,7 +7430,7 @@
       </w:rPr>
     </w:lvl>
   </w:abstractNum>
-  <w:abstractNum w:abstractNumId="38" w15:restartNumberingAfterBreak="0">
+  <w:abstractNum w:abstractNumId="39" w15:restartNumberingAfterBreak="0">
     <w:nsid w:val="50225C44"/>
     <w:multiLevelType w:val="multilevel"/>
     <w:tmpl w:val="B726A92C"/>
@@ -6890,7 +7579,7 @@
       </w:rPr>
     </w:lvl>
   </w:abstractNum>
-  <w:abstractNum w:abstractNumId="39" w15:restartNumberingAfterBreak="0">
+  <w:abstractNum w:abstractNumId="40" w15:restartNumberingAfterBreak="0">
     <w:nsid w:val="50A87135"/>
     <w:multiLevelType w:val="multilevel"/>
     <w:tmpl w:val="AC46AE08"/>
@@ -7039,7 +7728,7 @@
       </w:rPr>
     </w:lvl>
   </w:abstractNum>
-  <w:abstractNum w:abstractNumId="40" w15:restartNumberingAfterBreak="0">
+  <w:abstractNum w:abstractNumId="41" w15:restartNumberingAfterBreak="0">
     <w:nsid w:val="50C7225D"/>
     <w:multiLevelType w:val="multilevel"/>
     <w:tmpl w:val="0EB47974"/>
@@ -7188,7 +7877,7 @@
       </w:rPr>
     </w:lvl>
   </w:abstractNum>
-  <w:abstractNum w:abstractNumId="41" w15:restartNumberingAfterBreak="0">
+  <w:abstractNum w:abstractNumId="42" w15:restartNumberingAfterBreak="0">
     <w:nsid w:val="50D37742"/>
     <w:multiLevelType w:val="multilevel"/>
     <w:tmpl w:val="D86AF42A"/>
@@ -7337,7 +8026,7 @@
       </w:rPr>
     </w:lvl>
   </w:abstractNum>
-  <w:abstractNum w:abstractNumId="42" w15:restartNumberingAfterBreak="0">
+  <w:abstractNum w:abstractNumId="43" w15:restartNumberingAfterBreak="0">
     <w:nsid w:val="523C11BA"/>
     <w:multiLevelType w:val="multilevel"/>
     <w:tmpl w:val="5B4ABF7A"/>
@@ -7486,7 +8175,7 @@
       </w:rPr>
     </w:lvl>
   </w:abstractNum>
-  <w:abstractNum w:abstractNumId="43" w15:restartNumberingAfterBreak="0">
+  <w:abstractNum w:abstractNumId="44" w15:restartNumberingAfterBreak="0">
     <w:nsid w:val="52B06472"/>
     <w:multiLevelType w:val="multilevel"/>
     <w:tmpl w:val="91CCD2B2"/>
@@ -7635,7 +8324,7 @@
       </w:rPr>
     </w:lvl>
   </w:abstractNum>
-  <w:abstractNum w:abstractNumId="44" w15:restartNumberingAfterBreak="0">
+  <w:abstractNum w:abstractNumId="45" w15:restartNumberingAfterBreak="0">
     <w:nsid w:val="53762F2F"/>
     <w:multiLevelType w:val="multilevel"/>
     <w:tmpl w:val="9EE4098A"/>
@@ -7784,7 +8473,7 @@
       </w:rPr>
     </w:lvl>
   </w:abstractNum>
-  <w:abstractNum w:abstractNumId="45" w15:restartNumberingAfterBreak="0">
+  <w:abstractNum w:abstractNumId="46" w15:restartNumberingAfterBreak="0">
     <w:nsid w:val="58CF46B1"/>
     <w:multiLevelType w:val="multilevel"/>
     <w:tmpl w:val="5BAC3C24"/>
@@ -7933,7 +8622,7 @@
       </w:rPr>
     </w:lvl>
   </w:abstractNum>
-  <w:abstractNum w:abstractNumId="46" w15:restartNumberingAfterBreak="0">
+  <w:abstractNum w:abstractNumId="47" w15:restartNumberingAfterBreak="0">
     <w:nsid w:val="645843F3"/>
     <w:multiLevelType w:val="multilevel"/>
     <w:tmpl w:val="F120F122"/>
@@ -8082,7 +8771,7 @@
       </w:rPr>
     </w:lvl>
   </w:abstractNum>
-  <w:abstractNum w:abstractNumId="47" w15:restartNumberingAfterBreak="0">
+  <w:abstractNum w:abstractNumId="48" w15:restartNumberingAfterBreak="0">
     <w:nsid w:val="678B7A6C"/>
     <w:multiLevelType w:val="multilevel"/>
     <w:tmpl w:val="A9BE5CA2"/>
@@ -8231,7 +8920,7 @@
       </w:rPr>
     </w:lvl>
   </w:abstractNum>
-  <w:abstractNum w:abstractNumId="48" w15:restartNumberingAfterBreak="0">
+  <w:abstractNum w:abstractNumId="49" w15:restartNumberingAfterBreak="0">
     <w:nsid w:val="68FD11AB"/>
     <w:multiLevelType w:val="multilevel"/>
     <w:tmpl w:val="E33AA3B4"/>
@@ -8380,7 +9069,7 @@
       </w:rPr>
     </w:lvl>
   </w:abstractNum>
-  <w:abstractNum w:abstractNumId="49" w15:restartNumberingAfterBreak="0">
+  <w:abstractNum w:abstractNumId="50" w15:restartNumberingAfterBreak="0">
     <w:nsid w:val="6C942A4C"/>
     <w:multiLevelType w:val="multilevel"/>
     <w:tmpl w:val="A1D624DE"/>
@@ -8529,7 +9218,7 @@
       </w:rPr>
     </w:lvl>
   </w:abstractNum>
-  <w:abstractNum w:abstractNumId="50" w15:restartNumberingAfterBreak="0">
+  <w:abstractNum w:abstractNumId="51" w15:restartNumberingAfterBreak="0">
     <w:nsid w:val="7031688E"/>
     <w:multiLevelType w:val="multilevel"/>
     <w:tmpl w:val="E02A2A84"/>
@@ -8678,7 +9367,7 @@
       </w:rPr>
     </w:lvl>
   </w:abstractNum>
-  <w:abstractNum w:abstractNumId="51" w15:restartNumberingAfterBreak="0">
+  <w:abstractNum w:abstractNumId="52" w15:restartNumberingAfterBreak="0">
     <w:nsid w:val="70A95D9B"/>
     <w:multiLevelType w:val="multilevel"/>
     <w:tmpl w:val="B518E8EE"/>
@@ -8827,7 +9516,7 @@
       </w:rPr>
     </w:lvl>
   </w:abstractNum>
-  <w:abstractNum w:abstractNumId="52" w15:restartNumberingAfterBreak="0">
+  <w:abstractNum w:abstractNumId="53" w15:restartNumberingAfterBreak="0">
     <w:nsid w:val="7139699A"/>
     <w:multiLevelType w:val="multilevel"/>
     <w:tmpl w:val="0A3610AA"/>
@@ -8976,7 +9665,7 @@
       </w:rPr>
     </w:lvl>
   </w:abstractNum>
-  <w:abstractNum w:abstractNumId="53" w15:restartNumberingAfterBreak="0">
+  <w:abstractNum w:abstractNumId="54" w15:restartNumberingAfterBreak="0">
     <w:nsid w:val="74547CB6"/>
     <w:multiLevelType w:val="multilevel"/>
     <w:tmpl w:val="29D2B9CC"/>
@@ -9125,7 +9814,7 @@
       </w:rPr>
     </w:lvl>
   </w:abstractNum>
-  <w:abstractNum w:abstractNumId="54" w15:restartNumberingAfterBreak="0">
+  <w:abstractNum w:abstractNumId="55" w15:restartNumberingAfterBreak="0">
     <w:nsid w:val="7617320E"/>
     <w:multiLevelType w:val="multilevel"/>
     <w:tmpl w:val="F260163A"/>
@@ -9274,7 +9963,7 @@
       </w:rPr>
     </w:lvl>
   </w:abstractNum>
-  <w:abstractNum w:abstractNumId="55" w15:restartNumberingAfterBreak="0">
+  <w:abstractNum w:abstractNumId="56" w15:restartNumberingAfterBreak="0">
     <w:nsid w:val="7904563C"/>
     <w:multiLevelType w:val="multilevel"/>
     <w:tmpl w:val="02723256"/>
@@ -9423,7 +10112,7 @@
       </w:rPr>
     </w:lvl>
   </w:abstractNum>
-  <w:abstractNum w:abstractNumId="56" w15:restartNumberingAfterBreak="0">
+  <w:abstractNum w:abstractNumId="57" w15:restartNumberingAfterBreak="0">
     <w:nsid w:val="79CE29DF"/>
     <w:multiLevelType w:val="multilevel"/>
     <w:tmpl w:val="171A7FEA"/>
@@ -9572,7 +10261,7 @@
       </w:rPr>
     </w:lvl>
   </w:abstractNum>
-  <w:abstractNum w:abstractNumId="57" w15:restartNumberingAfterBreak="0">
+  <w:abstractNum w:abstractNumId="58" w15:restartNumberingAfterBreak="0">
     <w:nsid w:val="7A3D5565"/>
     <w:multiLevelType w:val="multilevel"/>
     <w:tmpl w:val="809E91E2"/>
@@ -9721,7 +10410,7 @@
       </w:rPr>
     </w:lvl>
   </w:abstractNum>
-  <w:abstractNum w:abstractNumId="58" w15:restartNumberingAfterBreak="0">
+  <w:abstractNum w:abstractNumId="59" w15:restartNumberingAfterBreak="0">
     <w:nsid w:val="7A8C0EBB"/>
     <w:multiLevelType w:val="multilevel"/>
     <w:tmpl w:val="AC4A0DA6"/>
@@ -9870,7 +10559,7 @@
       </w:rPr>
     </w:lvl>
   </w:abstractNum>
-  <w:abstractNum w:abstractNumId="59" w15:restartNumberingAfterBreak="0">
+  <w:abstractNum w:abstractNumId="60" w15:restartNumberingAfterBreak="0">
     <w:nsid w:val="7E3E6975"/>
     <w:multiLevelType w:val="multilevel"/>
     <w:tmpl w:val="0688F5B8"/>
@@ -10019,7 +10708,7 @@
       </w:rPr>
     </w:lvl>
   </w:abstractNum>
-  <w:abstractNum w:abstractNumId="60" w15:restartNumberingAfterBreak="0">
+  <w:abstractNum w:abstractNumId="61" w15:restartNumberingAfterBreak="0">
     <w:nsid w:val="7F8A24BA"/>
     <w:multiLevelType w:val="multilevel"/>
     <w:tmpl w:val="3E76C7B4"/>
@@ -10168,7 +10857,7 @@
       </w:rPr>
     </w:lvl>
   </w:abstractNum>
-  <w:abstractNum w:abstractNumId="61" w15:restartNumberingAfterBreak="0">
+  <w:abstractNum w:abstractNumId="62" w15:restartNumberingAfterBreak="0">
     <w:nsid w:val="7FAD6B38"/>
     <w:multiLevelType w:val="multilevel"/>
     <w:tmpl w:val="2B70CE82"/>
@@ -10318,190 +11007,193 @@
     </w:lvl>
   </w:abstractNum>
   <w:num w:numId="1" w16cid:durableId="680470870">
-    <w:abstractNumId w:val="50"/>
+    <w:abstractNumId w:val="51"/>
   </w:num>
   <w:num w:numId="2" w16cid:durableId="924412751">
-    <w:abstractNumId w:val="53"/>
+    <w:abstractNumId w:val="54"/>
   </w:num>
   <w:num w:numId="3" w16cid:durableId="1685521745">
     <w:abstractNumId w:val="2"/>
   </w:num>
   <w:num w:numId="4" w16cid:durableId="38358632">
-    <w:abstractNumId w:val="13"/>
+    <w:abstractNumId w:val="14"/>
   </w:num>
   <w:num w:numId="5" w16cid:durableId="369840866">
+    <w:abstractNumId w:val="26"/>
+  </w:num>
+  <w:num w:numId="6" w16cid:durableId="278757031">
+    <w:abstractNumId w:val="55"/>
+  </w:num>
+  <w:num w:numId="7" w16cid:durableId="1805807969">
     <w:abstractNumId w:val="25"/>
   </w:num>
-  <w:num w:numId="6" w16cid:durableId="278757031">
-    <w:abstractNumId w:val="54"/>
-  </w:num>
-  <w:num w:numId="7" w16cid:durableId="1805807969">
-    <w:abstractNumId w:val="24"/>
-  </w:num>
   <w:num w:numId="8" w16cid:durableId="1174609989">
-    <w:abstractNumId w:val="52"/>
+    <w:abstractNumId w:val="53"/>
   </w:num>
   <w:num w:numId="9" w16cid:durableId="246767066">
-    <w:abstractNumId w:val="27"/>
+    <w:abstractNumId w:val="28"/>
   </w:num>
   <w:num w:numId="10" w16cid:durableId="1538280194">
-    <w:abstractNumId w:val="40"/>
+    <w:abstractNumId w:val="41"/>
   </w:num>
   <w:num w:numId="11" w16cid:durableId="1049845479">
-    <w:abstractNumId w:val="43"/>
+    <w:abstractNumId w:val="44"/>
   </w:num>
   <w:num w:numId="12" w16cid:durableId="507333141">
-    <w:abstractNumId w:val="8"/>
+    <w:abstractNumId w:val="9"/>
   </w:num>
   <w:num w:numId="13" w16cid:durableId="685139055">
-    <w:abstractNumId w:val="44"/>
+    <w:abstractNumId w:val="45"/>
   </w:num>
   <w:num w:numId="14" w16cid:durableId="220602176">
-    <w:abstractNumId w:val="33"/>
+    <w:abstractNumId w:val="34"/>
   </w:num>
   <w:num w:numId="15" w16cid:durableId="46414992">
-    <w:abstractNumId w:val="11"/>
+    <w:abstractNumId w:val="12"/>
   </w:num>
   <w:num w:numId="16" w16cid:durableId="273246216">
-    <w:abstractNumId w:val="17"/>
+    <w:abstractNumId w:val="18"/>
   </w:num>
   <w:num w:numId="17" w16cid:durableId="972640206">
-    <w:abstractNumId w:val="35"/>
+    <w:abstractNumId w:val="36"/>
   </w:num>
   <w:num w:numId="18" w16cid:durableId="1035693356">
-    <w:abstractNumId w:val="36"/>
+    <w:abstractNumId w:val="37"/>
   </w:num>
   <w:num w:numId="19" w16cid:durableId="1726028644">
-    <w:abstractNumId w:val="56"/>
+    <w:abstractNumId w:val="57"/>
   </w:num>
   <w:num w:numId="20" w16cid:durableId="2053655691">
-    <w:abstractNumId w:val="60"/>
+    <w:abstractNumId w:val="61"/>
   </w:num>
   <w:num w:numId="21" w16cid:durableId="1715229244">
-    <w:abstractNumId w:val="29"/>
+    <w:abstractNumId w:val="30"/>
   </w:num>
   <w:num w:numId="22" w16cid:durableId="1122192662">
     <w:abstractNumId w:val="1"/>
   </w:num>
   <w:num w:numId="23" w16cid:durableId="694424687">
-    <w:abstractNumId w:val="5"/>
+    <w:abstractNumId w:val="6"/>
   </w:num>
   <w:num w:numId="24" w16cid:durableId="1719163974">
-    <w:abstractNumId w:val="12"/>
+    <w:abstractNumId w:val="13"/>
   </w:num>
   <w:num w:numId="25" w16cid:durableId="1243221952">
-    <w:abstractNumId w:val="30"/>
+    <w:abstractNumId w:val="31"/>
   </w:num>
   <w:num w:numId="26" w16cid:durableId="356272910">
-    <w:abstractNumId w:val="46"/>
+    <w:abstractNumId w:val="47"/>
   </w:num>
   <w:num w:numId="27" w16cid:durableId="787744551">
-    <w:abstractNumId w:val="9"/>
+    <w:abstractNumId w:val="10"/>
   </w:num>
   <w:num w:numId="28" w16cid:durableId="598414963">
     <w:abstractNumId w:val="0"/>
   </w:num>
   <w:num w:numId="29" w16cid:durableId="1052340997">
-    <w:abstractNumId w:val="55"/>
+    <w:abstractNumId w:val="56"/>
   </w:num>
   <w:num w:numId="30" w16cid:durableId="346715069">
-    <w:abstractNumId w:val="47"/>
+    <w:abstractNumId w:val="48"/>
   </w:num>
   <w:num w:numId="31" w16cid:durableId="961961194">
-    <w:abstractNumId w:val="34"/>
+    <w:abstractNumId w:val="35"/>
   </w:num>
   <w:num w:numId="32" w16cid:durableId="416443967">
-    <w:abstractNumId w:val="26"/>
+    <w:abstractNumId w:val="27"/>
   </w:num>
   <w:num w:numId="33" w16cid:durableId="1255359503">
+    <w:abstractNumId w:val="5"/>
+  </w:num>
+  <w:num w:numId="34" w16cid:durableId="1532959903">
+    <w:abstractNumId w:val="20"/>
+  </w:num>
+  <w:num w:numId="35" w16cid:durableId="1714646097">
+    <w:abstractNumId w:val="33"/>
+  </w:num>
+  <w:num w:numId="36" w16cid:durableId="174154743">
+    <w:abstractNumId w:val="24"/>
+  </w:num>
+  <w:num w:numId="37" w16cid:durableId="1655833981">
+    <w:abstractNumId w:val="46"/>
+  </w:num>
+  <w:num w:numId="38" w16cid:durableId="1434933503">
+    <w:abstractNumId w:val="29"/>
+  </w:num>
+  <w:num w:numId="39" w16cid:durableId="1627466827">
+    <w:abstractNumId w:val="49"/>
+  </w:num>
+  <w:num w:numId="40" w16cid:durableId="1287810986">
+    <w:abstractNumId w:val="52"/>
+  </w:num>
+  <w:num w:numId="41" w16cid:durableId="590894540">
+    <w:abstractNumId w:val="11"/>
+  </w:num>
+  <w:num w:numId="42" w16cid:durableId="1417750756">
+    <w:abstractNumId w:val="22"/>
+  </w:num>
+  <w:num w:numId="43" w16cid:durableId="716900521">
+    <w:abstractNumId w:val="60"/>
+  </w:num>
+  <w:num w:numId="44" w16cid:durableId="336619738">
+    <w:abstractNumId w:val="58"/>
+  </w:num>
+  <w:num w:numId="45" w16cid:durableId="50203372">
+    <w:abstractNumId w:val="40"/>
+  </w:num>
+  <w:num w:numId="46" w16cid:durableId="1888758593">
+    <w:abstractNumId w:val="17"/>
+  </w:num>
+  <w:num w:numId="47" w16cid:durableId="977153707">
+    <w:abstractNumId w:val="23"/>
+  </w:num>
+  <w:num w:numId="48" w16cid:durableId="503327914">
+    <w:abstractNumId w:val="15"/>
+  </w:num>
+  <w:num w:numId="49" w16cid:durableId="2068911226">
+    <w:abstractNumId w:val="19"/>
+  </w:num>
+  <w:num w:numId="50" w16cid:durableId="798837858">
+    <w:abstractNumId w:val="43"/>
+  </w:num>
+  <w:num w:numId="51" w16cid:durableId="301346678">
+    <w:abstractNumId w:val="16"/>
+  </w:num>
+  <w:num w:numId="52" w16cid:durableId="1341737601">
+    <w:abstractNumId w:val="7"/>
+  </w:num>
+  <w:num w:numId="53" w16cid:durableId="2085254632">
     <w:abstractNumId w:val="4"/>
   </w:num>
-  <w:num w:numId="34" w16cid:durableId="1532959903">
-    <w:abstractNumId w:val="19"/>
+  <w:num w:numId="54" w16cid:durableId="1504248127">
+    <w:abstractNumId w:val="21"/>
   </w:num>
-  <w:num w:numId="35" w16cid:durableId="1714646097">
+  <w:num w:numId="55" w16cid:durableId="1429305003">
+    <w:abstractNumId w:val="50"/>
+  </w:num>
+  <w:num w:numId="56" w16cid:durableId="1190529290">
+    <w:abstractNumId w:val="42"/>
+  </w:num>
+  <w:num w:numId="57" w16cid:durableId="2097554130">
+    <w:abstractNumId w:val="62"/>
+  </w:num>
+  <w:num w:numId="58" w16cid:durableId="1955404400">
+    <w:abstractNumId w:val="8"/>
+  </w:num>
+  <w:num w:numId="59" w16cid:durableId="1935165773">
+    <w:abstractNumId w:val="59"/>
+  </w:num>
+  <w:num w:numId="60" w16cid:durableId="2017345621">
+    <w:abstractNumId w:val="38"/>
+  </w:num>
+  <w:num w:numId="61" w16cid:durableId="1335960152">
     <w:abstractNumId w:val="32"/>
   </w:num>
-  <w:num w:numId="36" w16cid:durableId="174154743">
-    <w:abstractNumId w:val="23"/>
-  </w:num>
-  <w:num w:numId="37" w16cid:durableId="1655833981">
-    <w:abstractNumId w:val="45"/>
-  </w:num>
-  <w:num w:numId="38" w16cid:durableId="1434933503">
-    <w:abstractNumId w:val="28"/>
-  </w:num>
-  <w:num w:numId="39" w16cid:durableId="1627466827">
-    <w:abstractNumId w:val="48"/>
-  </w:num>
-  <w:num w:numId="40" w16cid:durableId="1287810986">
-    <w:abstractNumId w:val="51"/>
-  </w:num>
-  <w:num w:numId="41" w16cid:durableId="590894540">
-    <w:abstractNumId w:val="10"/>
-  </w:num>
-  <w:num w:numId="42" w16cid:durableId="1417750756">
-    <w:abstractNumId w:val="21"/>
-  </w:num>
-  <w:num w:numId="43" w16cid:durableId="716900521">
-    <w:abstractNumId w:val="59"/>
-  </w:num>
-  <w:num w:numId="44" w16cid:durableId="336619738">
-    <w:abstractNumId w:val="57"/>
-  </w:num>
-  <w:num w:numId="45" w16cid:durableId="50203372">
+  <w:num w:numId="62" w16cid:durableId="1493637760">
     <w:abstractNumId w:val="39"/>
   </w:num>
-  <w:num w:numId="46" w16cid:durableId="1888758593">
-    <w:abstractNumId w:val="16"/>
-  </w:num>
-  <w:num w:numId="47" w16cid:durableId="977153707">
-    <w:abstractNumId w:val="22"/>
-  </w:num>
-  <w:num w:numId="48" w16cid:durableId="503327914">
-    <w:abstractNumId w:val="14"/>
-  </w:num>
-  <w:num w:numId="49" w16cid:durableId="2068911226">
-    <w:abstractNumId w:val="18"/>
-  </w:num>
-  <w:num w:numId="50" w16cid:durableId="798837858">
-    <w:abstractNumId w:val="42"/>
-  </w:num>
-  <w:num w:numId="51" w16cid:durableId="301346678">
-    <w:abstractNumId w:val="15"/>
-  </w:num>
-  <w:num w:numId="52" w16cid:durableId="1341737601">
-    <w:abstractNumId w:val="6"/>
-  </w:num>
-  <w:num w:numId="53" w16cid:durableId="2085254632">
+  <w:num w:numId="63" w16cid:durableId="776218599">
     <w:abstractNumId w:val="3"/>
-  </w:num>
-  <w:num w:numId="54" w16cid:durableId="1504248127">
-    <w:abstractNumId w:val="20"/>
-  </w:num>
-  <w:num w:numId="55" w16cid:durableId="1429305003">
-    <w:abstractNumId w:val="49"/>
-  </w:num>
-  <w:num w:numId="56" w16cid:durableId="1190529290">
-    <w:abstractNumId w:val="41"/>
-  </w:num>
-  <w:num w:numId="57" w16cid:durableId="2097554130">
-    <w:abstractNumId w:val="61"/>
-  </w:num>
-  <w:num w:numId="58" w16cid:durableId="1955404400">
-    <w:abstractNumId w:val="7"/>
-  </w:num>
-  <w:num w:numId="59" w16cid:durableId="1935165773">
-    <w:abstractNumId w:val="58"/>
-  </w:num>
-  <w:num w:numId="60" w16cid:durableId="2017345621">
-    <w:abstractNumId w:val="37"/>
-  </w:num>
-  <w:num w:numId="61" w16cid:durableId="1335960152">
-    <w:abstractNumId w:val="31"/>
-  </w:num>
-  <w:num w:numId="62" w16cid:durableId="1493637760">
-    <w:abstractNumId w:val="38"/>
   </w:num>
 </w:numbering>
 </file>
@@ -11108,6 +11800,7 @@
   <w:style w:type="character" w:default="1" w:styleId="DefaultParagraphFont">
     <w:name w:val="Default Paragraph Font"/>
     <w:uiPriority w:val="1"/>
+    <w:semiHidden/>
     <w:unhideWhenUsed/>
   </w:style>
   <w:style w:type="table" w:default="1" w:styleId="TableNormal">

</xml_diff>